<commit_message>
docs(parceria-cna): roteiro do vídeo e números conferidos na fonte
Adiciona o roteiro do vídeo para a CNA e corrige proposta, nota técnica,
ofício e deck após a conferência de 22/10/2026:
- 28%: refeito do zero e atualizado até set/2026; vale para fretes com
  destino a Miritituba -> exportação por Santarém e Belém (no Arco Norte
  agregado o ganho cai para 24% após mai/2026).
- 80%: vale para soja e milho (PAM 2024), não para a safra toda.
- Silo: a sobra está no RS, em SC e em SP; o PR também tem falta.
- BR-163: -11% em 12 meses na rota Sorriso->Miritituba (Conab, set/2020),
  sem atribuir causa ao asfalto.
- Beef Roads: o TraNSIT calculou a economia de frete; não ranqueou.

Co-Authored-By: Claude Opus 5.5 <noreply@anthropic.com>
</commit_message>
<xml_diff>
--- a/docs/parceria-cna/nota-tecnica-proposta-cna.docx
+++ b/docs/parceria-cna/nota-tecnica-proposta-cna.docx
@@ -151,7 +151,7 @@
         <w:t xml:space="preserve">• Antecipação: </w:t>
       </w:r>
       <w:r>
-        <w:t xml:space="preserve">o indicador baseado nos registros de frete previu a exportação de soja e milho pelos portos do Tapajós com erro 28% menor que o modelo de referência, em teste fora da amostra no período 2023–2026.</w:t>
+        <w:t xml:space="preserve">o indicador baseado nos registros de frete previu a exportação de soja e milho pelos portos de Santarém e Belém, a partir dos fretes com destino a Miritituba, com erro 28% menor que o modelo de referência, em teste fora da amostra no período de fevereiro de 2023 a setembro de 2026.</w:t>
       </w:r>
     </w:p>
     <w:p>
@@ -168,7 +168,7 @@
         <w:t xml:space="preserve">• Armazenagem: </w:t>
       </w:r>
       <w:r>
-        <w:t xml:space="preserve">o déficit de capacidade estática somado microrregião por microrregião alcança 88 milhões de toneladas, acima do saldo nacional de 52 milhões, porque a capacidade excedente no Sul não atende o Centro-Norte. Doze microrregiões concentram 28,7 milhões de toneladas de déficit.</w:t>
+        <w:t xml:space="preserve">o déficit de capacidade estática somado microrregião por microrregião alcança 88 milhões de toneladas, acima do saldo nacional de 52 milhões, porque a capacidade excedente no Rio Grande do Sul, em Santa Catarina e em São Paulo não atende o Centro-Norte. Doze microrregiões concentram 28,7 milhões de toneladas de déficit.</w:t>
       </w:r>
     </w:p>
     <w:p>

</xml_diff>